<commit_message>
fix: rebuild TTN template with proper codes table (ОКУД/ОКПО/ОКДП) in top-right header using flat rowspan layout
Co-authored-by: Rekhmunov <Rekhmunov@users.noreply.github.com>
</commit_message>
<xml_diff>
--- a/web_static/torg12_tpl.docx
+++ b/web_static/torg12_tpl.docx
@@ -17,14 +17,18 @@
         </w:tblCellMar>
       </w:tblPr>
       <w:tblGrid>
-        <w:gridCol w:w="8232"/>
-        <w:gridCol w:w="4745"/>
-        <w:gridCol w:w="2556"/>
+        <w:gridCol w:w="8543"/>
+        <w:gridCol w:w="4349"/>
+        <w:gridCol w:w="2641"/>
       </w:tblGrid>
       <w:tr>
-        <w:tc>
-          <w:tcPr>
-            <w:tcW w:w="8232" w:type="dxa"/>
+        <w:trPr>
+          <w:trHeight w:val="180" w:hRule="atLeast"/>
+        </w:trPr>
+        <w:tc>
+          <w:tcPr>
+            <w:tcW w:w="8543" w:type="dxa"/>
+            <w:vMerge w:val="restart"/>
             <w:vAlign w:val="top"/>
             <w:tcBorders>
               <w:top w:val="none" w:sz="0"/>
@@ -88,9 +92,9 @@
         </w:tc>
         <w:tc>
           <w:tcPr>
-            <w:tcW w:w="7301" w:type="dxa"/>
+            <w:tcW w:w="6990" w:type="dxa"/>
             <w:gridSpan w:val="2"/>
-            <w:vAlign w:val="top"/>
+            <w:vAlign w:val="bottom"/>
             <w:tcBorders>
               <w:top w:val="none" w:sz="0"/>
               <w:left w:val="none" w:sz="0"/>
@@ -115,21 +119,7 @@
                 <w:sz w:val="12"/>
                 <w:szCs w:val="12"/>
               </w:rPr>
-              <w:t xml:space="preserve">Унифицированная форма № ТОРГ-12</w:t>
-            </w:r>
-          </w:p>
-          <w:p>
-            <w:pPr>
-              <w:jc w:val="right"/>
-              <w:spacing w:before="0" w:after="0" w:line="240" w:lineRule="auto"/>
-            </w:pPr>
-            <w:r>
-              <w:rPr>
-                <w:rFonts w:ascii="Times New Roman" w:hAnsi="Times New Roman" w:cs="Times New Roman"/>
-                <w:sz w:val="12"/>
-                <w:szCs w:val="12"/>
-              </w:rPr>
-              <w:t xml:space="preserve">Утверждена постановлением Госкомстата России от 25.12.98 №132</w:t>
+              <w:t xml:space="preserve">Унифицированная форма № ТОРГ-12 Утверждена постановлением Госкомстата России от 25.12.98 №132</w:t>
             </w:r>
           </w:p>
         </w:tc>
@@ -140,7 +130,8 @@
         </w:trPr>
         <w:tc>
           <w:tcPr>
-            <w:tcW w:w="8232" w:type="dxa"/>
+            <w:tcW w:w="8543" w:type="dxa"/>
+            <w:vMerge/>
             <w:vAlign w:val="center"/>
             <w:tcBorders>
               <w:top w:val="none" w:sz="0"/>
@@ -164,7 +155,8 @@
         </w:tc>
         <w:tc>
           <w:tcPr>
-            <w:tcW w:w="4745" w:type="dxa"/>
+            <w:tcW w:w="6990" w:type="dxa"/>
+            <w:gridSpan w:val="2"/>
             <w:vAlign w:val="center"/>
             <w:tcBorders>
               <w:top w:val="single" w:sz="4" w:color="000000"/>
@@ -192,39 +184,7 @@
                 <w:b/>
                 <w:bCs/>
               </w:rPr>
-              <w:t xml:space="preserve">Коды</w:t>
-            </w:r>
-          </w:p>
-        </w:tc>
-        <w:tc>
-          <w:tcPr>
-            <w:tcW w:w="2556" w:type="dxa"/>
-            <w:vAlign w:val="center"/>
-            <w:tcBorders>
-              <w:top w:val="single" w:sz="4" w:color="000000"/>
-              <w:left w:val="single" w:sz="4" w:color="000000"/>
-              <w:bottom w:val="single" w:sz="4" w:color="000000"/>
-              <w:right w:val="single" w:sz="4" w:color="000000"/>
-            </w:tcBorders>
-            <w:tcMar>
-              <w:top w:w="28" w:type="dxa"/>
-              <w:left w:w="57" w:type="dxa"/>
-              <w:bottom w:w="28" w:type="dxa"/>
-              <w:right w:w="57" w:type="dxa"/>
-            </w:tcMar>
-          </w:tcPr>
-          <w:p>
-            <w:pPr>
-              <w:jc w:val="center"/>
-              <w:spacing w:before="0" w:after="0" w:line="240" w:lineRule="auto"/>
-            </w:pPr>
-            <w:r>
-              <w:rPr>
-                <w:rFonts w:ascii="Times New Roman" w:hAnsi="Times New Roman" w:cs="Times New Roman"/>
-                <w:sz w:val="12"/>
-                <w:szCs w:val="12"/>
-              </w:rPr>
-              <w:t xml:space="preserve"/>
+              <w:t xml:space="preserve">Код</w:t>
             </w:r>
           </w:p>
         </w:tc>
@@ -235,7 +195,8 @@
         </w:trPr>
         <w:tc>
           <w:tcPr>
-            <w:tcW w:w="8232" w:type="dxa"/>
+            <w:tcW w:w="8543" w:type="dxa"/>
+            <w:vMerge/>
             <w:vAlign w:val="center"/>
             <w:tcBorders>
               <w:top w:val="none" w:sz="0"/>
@@ -259,7 +220,7 @@
         </w:tc>
         <w:tc>
           <w:tcPr>
-            <w:tcW w:w="4745" w:type="dxa"/>
+            <w:tcW w:w="4349" w:type="dxa"/>
             <w:vAlign w:val="center"/>
             <w:tcBorders>
               <w:top w:val="single" w:sz="4" w:color="000000"/>
@@ -291,7 +252,7 @@
         </w:tc>
         <w:tc>
           <w:tcPr>
-            <w:tcW w:w="2556" w:type="dxa"/>
+            <w:tcW w:w="2641" w:type="dxa"/>
             <w:vAlign w:val="center"/>
             <w:tcBorders>
               <w:top w:val="single" w:sz="4" w:color="000000"/>
@@ -328,7 +289,8 @@
         </w:trPr>
         <w:tc>
           <w:tcPr>
-            <w:tcW w:w="8232" w:type="dxa"/>
+            <w:tcW w:w="8543" w:type="dxa"/>
+            <w:vMerge/>
             <w:vAlign w:val="center"/>
             <w:tcBorders>
               <w:top w:val="none" w:sz="0"/>
@@ -352,7 +314,7 @@
         </w:tc>
         <w:tc>
           <w:tcPr>
-            <w:tcW w:w="4745" w:type="dxa"/>
+            <w:tcW w:w="4349" w:type="dxa"/>
             <w:vAlign w:val="center"/>
             <w:tcBorders>
               <w:top w:val="single" w:sz="4" w:color="000000"/>
@@ -384,7 +346,7 @@
         </w:tc>
         <w:tc>
           <w:tcPr>
-            <w:tcW w:w="2556" w:type="dxa"/>
+            <w:tcW w:w="2641" w:type="dxa"/>
             <w:vAlign w:val="center"/>
             <w:tcBorders>
               <w:top w:val="single" w:sz="4" w:color="000000"/>
@@ -421,7 +383,8 @@
         </w:trPr>
         <w:tc>
           <w:tcPr>
-            <w:tcW w:w="8232" w:type="dxa"/>
+            <w:tcW w:w="8543" w:type="dxa"/>
+            <w:vMerge/>
             <w:vAlign w:val="center"/>
             <w:tcBorders>
               <w:top w:val="none" w:sz="0"/>
@@ -445,7 +408,7 @@
         </w:tc>
         <w:tc>
           <w:tcPr>
-            <w:tcW w:w="4745" w:type="dxa"/>
+            <w:tcW w:w="4349" w:type="dxa"/>
             <w:vAlign w:val="center"/>
             <w:tcBorders>
               <w:top w:val="single" w:sz="4" w:color="000000"/>
@@ -477,7 +440,7 @@
         </w:tc>
         <w:tc>
           <w:tcPr>
-            <w:tcW w:w="2556" w:type="dxa"/>
+            <w:tcW w:w="2641" w:type="dxa"/>
             <w:vAlign w:val="center"/>
             <w:tcBorders>
               <w:top w:val="single" w:sz="4" w:color="000000"/>
@@ -537,7 +500,7 @@
       </w:tblGrid>
       <w:tr>
         <w:trPr>
-          <w:trHeight w:val="320" w:hRule="atLeast"/>
+          <w:trHeight w:val="300" w:hRule="atLeast"/>
         </w:trPr>
         <w:tc>
           <w:tcPr>
@@ -736,7 +699,7 @@
       </w:tr>
       <w:tr>
         <w:trPr>
-          <w:trHeight w:val="320" w:hRule="atLeast"/>
+          <w:trHeight w:val="300" w:hRule="atLeast"/>
         </w:trPr>
         <w:tc>
           <w:tcPr>
@@ -935,7 +898,7 @@
       </w:tr>
       <w:tr>
         <w:trPr>
-          <w:trHeight w:val="320" w:hRule="atLeast"/>
+          <w:trHeight w:val="300" w:hRule="atLeast"/>
         </w:trPr>
         <w:tc>
           <w:tcPr>
@@ -1245,7 +1208,7 @@
                 <w:sz w:val="12"/>
                 <w:szCs w:val="12"/>
               </w:rPr>
-              <w:t xml:space="preserve">номер         дата</w:t>
+              <w:t xml:space="preserve">номер           дата</w:t>
             </w:r>
           </w:p>
           <w:p>
@@ -1559,8 +1522,6 @@
                 <w:rFonts w:ascii="Times New Roman" w:hAnsi="Times New Roman" w:cs="Times New Roman"/>
                 <w:sz w:val="12"/>
                 <w:szCs w:val="12"/>
-                <w:b/>
-                <w:bCs/>
               </w:rPr>
               <w:t xml:space="preserve">Номер по порядку</w:t>
             </w:r>
@@ -1932,7 +1893,7 @@
       </w:tr>
       <w:tr>
         <w:trPr>
-          <w:trHeight w:val="280" w:hRule="atLeast"/>
+          <w:trHeight w:val="260" w:hRule="atLeast"/>
         </w:trPr>
         <w:tc>
           <w:tcPr>
@@ -2323,428 +2284,6 @@
                 <w:szCs w:val="12"/>
               </w:rPr>
               <w:t xml:space="preserve">сумма, руб. коп.</w:t>
-            </w:r>
-          </w:p>
-        </w:tc>
-        <w:tc>
-          <w:tcPr>
-            <w:tcW w:w="2650" w:type="dxa"/>
-            <w:vMerge/>
-            <w:vAlign w:val="center"/>
-            <w:tcBorders>
-              <w:top w:val="single" w:sz="4" w:color="000000"/>
-              <w:left w:val="single" w:sz="4" w:color="000000"/>
-              <w:bottom w:val="single" w:sz="4" w:color="000000"/>
-              <w:right w:val="single" w:sz="4" w:color="000000"/>
-            </w:tcBorders>
-            <w:tcMar>
-              <w:top w:w="28" w:type="dxa"/>
-              <w:left w:w="57" w:type="dxa"/>
-              <w:bottom w:w="28" w:type="dxa"/>
-              <w:right w:w="57" w:type="dxa"/>
-            </w:tcMar>
-          </w:tcPr>
-          <w:p>
-            <w:pPr>
-              <w:jc w:val="left"/>
-              <w:spacing w:before="0" w:after="0" w:line="240" w:lineRule="auto"/>
-            </w:pPr>
-          </w:p>
-        </w:tc>
-      </w:tr>
-      <w:tr>
-        <w:trPr>
-          <w:trHeight w:val="240" w:hRule="atLeast"/>
-        </w:trPr>
-        <w:tc>
-          <w:tcPr>
-            <w:tcW w:w="465" w:type="dxa"/>
-            <w:vMerge/>
-            <w:vAlign w:val="center"/>
-            <w:tcBorders>
-              <w:top w:val="single" w:sz="4" w:color="000000"/>
-              <w:left w:val="single" w:sz="4" w:color="000000"/>
-              <w:bottom w:val="single" w:sz="4" w:color="000000"/>
-              <w:right w:val="single" w:sz="4" w:color="000000"/>
-            </w:tcBorders>
-            <w:tcMar>
-              <w:top w:w="28" w:type="dxa"/>
-              <w:left w:w="57" w:type="dxa"/>
-              <w:bottom w:w="28" w:type="dxa"/>
-              <w:right w:w="57" w:type="dxa"/>
-            </w:tcMar>
-          </w:tcPr>
-          <w:p>
-            <w:pPr>
-              <w:jc w:val="left"/>
-              <w:spacing w:before="0" w:after="0" w:line="240" w:lineRule="auto"/>
-            </w:pPr>
-          </w:p>
-        </w:tc>
-        <w:tc>
-          <w:tcPr>
-            <w:tcW w:w="2795" w:type="dxa"/>
-            <w:vMerge/>
-            <w:vAlign w:val="center"/>
-            <w:tcBorders>
-              <w:top w:val="single" w:sz="4" w:color="000000"/>
-              <w:left w:val="single" w:sz="4" w:color="000000"/>
-              <w:bottom w:val="single" w:sz="4" w:color="000000"/>
-              <w:right w:val="single" w:sz="4" w:color="000000"/>
-            </w:tcBorders>
-            <w:tcMar>
-              <w:top w:w="28" w:type="dxa"/>
-              <w:left w:w="57" w:type="dxa"/>
-              <w:bottom w:w="28" w:type="dxa"/>
-              <w:right w:w="57" w:type="dxa"/>
-            </w:tcMar>
-          </w:tcPr>
-          <w:p>
-            <w:pPr>
-              <w:jc w:val="left"/>
-              <w:spacing w:before="0" w:after="0" w:line="240" w:lineRule="auto"/>
-            </w:pPr>
-          </w:p>
-        </w:tc>
-        <w:tc>
-          <w:tcPr>
-            <w:tcW w:w="465" w:type="dxa"/>
-            <w:vMerge/>
-            <w:vAlign w:val="center"/>
-            <w:tcBorders>
-              <w:top w:val="single" w:sz="4" w:color="000000"/>
-              <w:left w:val="single" w:sz="4" w:color="000000"/>
-              <w:bottom w:val="single" w:sz="4" w:color="000000"/>
-              <w:right w:val="single" w:sz="4" w:color="000000"/>
-            </w:tcBorders>
-            <w:tcMar>
-              <w:top w:w="28" w:type="dxa"/>
-              <w:left w:w="57" w:type="dxa"/>
-              <w:bottom w:w="28" w:type="dxa"/>
-              <w:right w:w="57" w:type="dxa"/>
-            </w:tcMar>
-          </w:tcPr>
-          <w:p>
-            <w:pPr>
-              <w:jc w:val="left"/>
-              <w:spacing w:before="0" w:after="0" w:line="240" w:lineRule="auto"/>
-            </w:pPr>
-          </w:p>
-        </w:tc>
-        <w:tc>
-          <w:tcPr>
-            <w:tcW w:w="776" w:type="dxa"/>
-            <w:vAlign w:val="center"/>
-            <w:tcBorders>
-              <w:top w:val="single" w:sz="4" w:color="000000"/>
-              <w:left w:val="single" w:sz="4" w:color="000000"/>
-              <w:bottom w:val="single" w:sz="4" w:color="000000"/>
-              <w:right w:val="single" w:sz="4" w:color="000000"/>
-            </w:tcBorders>
-            <w:tcMar>
-              <w:top w:w="28" w:type="dxa"/>
-              <w:left w:w="57" w:type="dxa"/>
-              <w:bottom w:w="28" w:type="dxa"/>
-              <w:right w:w="57" w:type="dxa"/>
-            </w:tcMar>
-          </w:tcPr>
-          <w:p>
-            <w:pPr>
-              <w:jc w:val="center"/>
-              <w:spacing w:before="0" w:after="0" w:line="240" w:lineRule="auto"/>
-            </w:pPr>
-            <w:r>
-              <w:rPr>
-                <w:rFonts w:ascii="Times New Roman" w:hAnsi="Times New Roman" w:cs="Times New Roman"/>
-                <w:sz w:val="12"/>
-                <w:szCs w:val="12"/>
-              </w:rPr>
-              <w:t xml:space="preserve">4</w:t>
-            </w:r>
-          </w:p>
-        </w:tc>
-        <w:tc>
-          <w:tcPr>
-            <w:tcW w:w="621" w:type="dxa"/>
-            <w:vAlign w:val="center"/>
-            <w:tcBorders>
-              <w:top w:val="single" w:sz="4" w:color="000000"/>
-              <w:left w:val="single" w:sz="4" w:color="000000"/>
-              <w:bottom w:val="single" w:sz="4" w:color="000000"/>
-              <w:right w:val="single" w:sz="4" w:color="000000"/>
-            </w:tcBorders>
-            <w:tcMar>
-              <w:top w:w="28" w:type="dxa"/>
-              <w:left w:w="57" w:type="dxa"/>
-              <w:bottom w:w="28" w:type="dxa"/>
-              <w:right w:w="57" w:type="dxa"/>
-            </w:tcMar>
-          </w:tcPr>
-          <w:p>
-            <w:pPr>
-              <w:jc w:val="center"/>
-              <w:spacing w:before="0" w:after="0" w:line="240" w:lineRule="auto"/>
-            </w:pPr>
-            <w:r>
-              <w:rPr>
-                <w:rFonts w:ascii="Times New Roman" w:hAnsi="Times New Roman" w:cs="Times New Roman"/>
-                <w:sz w:val="12"/>
-                <w:szCs w:val="12"/>
-              </w:rPr>
-              <w:t xml:space="preserve">5</w:t>
-            </w:r>
-          </w:p>
-        </w:tc>
-        <w:tc>
-          <w:tcPr>
-            <w:tcW w:w="621" w:type="dxa"/>
-            <w:vMerge/>
-            <w:vAlign w:val="center"/>
-            <w:tcBorders>
-              <w:top w:val="single" w:sz="4" w:color="000000"/>
-              <w:left w:val="single" w:sz="4" w:color="000000"/>
-              <w:bottom w:val="single" w:sz="4" w:color="000000"/>
-              <w:right w:val="single" w:sz="4" w:color="000000"/>
-            </w:tcBorders>
-            <w:tcMar>
-              <w:top w:w="28" w:type="dxa"/>
-              <w:left w:w="57" w:type="dxa"/>
-              <w:bottom w:w="28" w:type="dxa"/>
-              <w:right w:w="57" w:type="dxa"/>
-            </w:tcMar>
-          </w:tcPr>
-          <w:p>
-            <w:pPr>
-              <w:jc w:val="left"/>
-              <w:spacing w:before="0" w:after="0" w:line="240" w:lineRule="auto"/>
-            </w:pPr>
-          </w:p>
-        </w:tc>
-        <w:tc>
-          <w:tcPr>
-            <w:tcW w:w="776" w:type="dxa"/>
-            <w:vAlign w:val="center"/>
-            <w:tcBorders>
-              <w:top w:val="single" w:sz="4" w:color="000000"/>
-              <w:left w:val="single" w:sz="4" w:color="000000"/>
-              <w:bottom w:val="single" w:sz="4" w:color="000000"/>
-              <w:right w:val="single" w:sz="4" w:color="000000"/>
-            </w:tcBorders>
-            <w:tcMar>
-              <w:top w:w="28" w:type="dxa"/>
-              <w:left w:w="57" w:type="dxa"/>
-              <w:bottom w:w="28" w:type="dxa"/>
-              <w:right w:w="57" w:type="dxa"/>
-            </w:tcMar>
-          </w:tcPr>
-          <w:p>
-            <w:pPr>
-              <w:jc w:val="center"/>
-              <w:spacing w:before="0" w:after="0" w:line="240" w:lineRule="auto"/>
-            </w:pPr>
-            <w:r>
-              <w:rPr>
-                <w:rFonts w:ascii="Times New Roman" w:hAnsi="Times New Roman" w:cs="Times New Roman"/>
-                <w:sz w:val="12"/>
-                <w:szCs w:val="12"/>
-              </w:rPr>
-              <w:t xml:space="preserve">7</w:t>
-            </w:r>
-          </w:p>
-        </w:tc>
-        <w:tc>
-          <w:tcPr>
-            <w:tcW w:w="776" w:type="dxa"/>
-            <w:vAlign w:val="center"/>
-            <w:tcBorders>
-              <w:top w:val="single" w:sz="4" w:color="000000"/>
-              <w:left w:val="single" w:sz="4" w:color="000000"/>
-              <w:bottom w:val="single" w:sz="4" w:color="000000"/>
-              <w:right w:val="single" w:sz="4" w:color="000000"/>
-            </w:tcBorders>
-            <w:tcMar>
-              <w:top w:w="28" w:type="dxa"/>
-              <w:left w:w="57" w:type="dxa"/>
-              <w:bottom w:w="28" w:type="dxa"/>
-              <w:right w:w="57" w:type="dxa"/>
-            </w:tcMar>
-          </w:tcPr>
-          <w:p>
-            <w:pPr>
-              <w:jc w:val="center"/>
-              <w:spacing w:before="0" w:after="0" w:line="240" w:lineRule="auto"/>
-            </w:pPr>
-            <w:r>
-              <w:rPr>
-                <w:rFonts w:ascii="Times New Roman" w:hAnsi="Times New Roman" w:cs="Times New Roman"/>
-                <w:sz w:val="12"/>
-                <w:szCs w:val="12"/>
-              </w:rPr>
-              <w:t xml:space="preserve">8</w:t>
-            </w:r>
-          </w:p>
-        </w:tc>
-        <w:tc>
-          <w:tcPr>
-            <w:tcW w:w="776" w:type="dxa"/>
-            <w:vMerge/>
-            <w:vAlign w:val="center"/>
-            <w:tcBorders>
-              <w:top w:val="single" w:sz="4" w:color="000000"/>
-              <w:left w:val="single" w:sz="4" w:color="000000"/>
-              <w:bottom w:val="single" w:sz="4" w:color="000000"/>
-              <w:right w:val="single" w:sz="4" w:color="000000"/>
-            </w:tcBorders>
-            <w:tcMar>
-              <w:top w:w="28" w:type="dxa"/>
-              <w:left w:w="57" w:type="dxa"/>
-              <w:bottom w:w="28" w:type="dxa"/>
-              <w:right w:w="57" w:type="dxa"/>
-            </w:tcMar>
-          </w:tcPr>
-          <w:p>
-            <w:pPr>
-              <w:jc w:val="left"/>
-              <w:spacing w:before="0" w:after="0" w:line="240" w:lineRule="auto"/>
-            </w:pPr>
-          </w:p>
-        </w:tc>
-        <w:tc>
-          <w:tcPr>
-            <w:tcW w:w="776" w:type="dxa"/>
-            <w:vMerge/>
-            <w:vAlign w:val="center"/>
-            <w:tcBorders>
-              <w:top w:val="single" w:sz="4" w:color="000000"/>
-              <w:left w:val="single" w:sz="4" w:color="000000"/>
-              <w:bottom w:val="single" w:sz="4" w:color="000000"/>
-              <w:right w:val="single" w:sz="4" w:color="000000"/>
-            </w:tcBorders>
-            <w:tcMar>
-              <w:top w:w="28" w:type="dxa"/>
-              <w:left w:w="57" w:type="dxa"/>
-              <w:bottom w:w="28" w:type="dxa"/>
-              <w:right w:w="57" w:type="dxa"/>
-            </w:tcMar>
-          </w:tcPr>
-          <w:p>
-            <w:pPr>
-              <w:jc w:val="left"/>
-              <w:spacing w:before="0" w:after="0" w:line="240" w:lineRule="auto"/>
-            </w:pPr>
-          </w:p>
-        </w:tc>
-        <w:tc>
-          <w:tcPr>
-            <w:tcW w:w="931" w:type="dxa"/>
-            <w:vMerge/>
-            <w:vAlign w:val="center"/>
-            <w:tcBorders>
-              <w:top w:val="single" w:sz="4" w:color="000000"/>
-              <w:left w:val="single" w:sz="4" w:color="000000"/>
-              <w:bottom w:val="single" w:sz="4" w:color="000000"/>
-              <w:right w:val="single" w:sz="4" w:color="000000"/>
-            </w:tcBorders>
-            <w:tcMar>
-              <w:top w:w="28" w:type="dxa"/>
-              <w:left w:w="57" w:type="dxa"/>
-              <w:bottom w:w="28" w:type="dxa"/>
-              <w:right w:w="57" w:type="dxa"/>
-            </w:tcMar>
-          </w:tcPr>
-          <w:p>
-            <w:pPr>
-              <w:jc w:val="left"/>
-              <w:spacing w:before="0" w:after="0" w:line="240" w:lineRule="auto"/>
-            </w:pPr>
-          </w:p>
-        </w:tc>
-        <w:tc>
-          <w:tcPr>
-            <w:tcW w:w="1242" w:type="dxa"/>
-            <w:vMerge/>
-            <w:vAlign w:val="center"/>
-            <w:tcBorders>
-              <w:top w:val="single" w:sz="4" w:color="000000"/>
-              <w:left w:val="single" w:sz="4" w:color="000000"/>
-              <w:bottom w:val="single" w:sz="4" w:color="000000"/>
-              <w:right w:val="single" w:sz="4" w:color="000000"/>
-            </w:tcBorders>
-            <w:tcMar>
-              <w:top w:w="28" w:type="dxa"/>
-              <w:left w:w="57" w:type="dxa"/>
-              <w:bottom w:w="28" w:type="dxa"/>
-              <w:right w:w="57" w:type="dxa"/>
-            </w:tcMar>
-          </w:tcPr>
-          <w:p>
-            <w:pPr>
-              <w:jc w:val="left"/>
-              <w:spacing w:before="0" w:after="0" w:line="240" w:lineRule="auto"/>
-            </w:pPr>
-          </w:p>
-        </w:tc>
-        <w:tc>
-          <w:tcPr>
-            <w:tcW w:w="776" w:type="dxa"/>
-            <w:vAlign w:val="center"/>
-            <w:tcBorders>
-              <w:top w:val="single" w:sz="4" w:color="000000"/>
-              <w:left w:val="single" w:sz="4" w:color="000000"/>
-              <w:bottom w:val="single" w:sz="4" w:color="000000"/>
-              <w:right w:val="single" w:sz="4" w:color="000000"/>
-            </w:tcBorders>
-            <w:tcMar>
-              <w:top w:w="28" w:type="dxa"/>
-              <w:left w:w="57" w:type="dxa"/>
-              <w:bottom w:w="28" w:type="dxa"/>
-              <w:right w:w="57" w:type="dxa"/>
-            </w:tcMar>
-          </w:tcPr>
-          <w:p>
-            <w:pPr>
-              <w:jc w:val="center"/>
-              <w:spacing w:before="0" w:after="0" w:line="240" w:lineRule="auto"/>
-            </w:pPr>
-            <w:r>
-              <w:rPr>
-                <w:rFonts w:ascii="Times New Roman" w:hAnsi="Times New Roman" w:cs="Times New Roman"/>
-                <w:sz w:val="12"/>
-                <w:szCs w:val="12"/>
-              </w:rPr>
-              <w:t xml:space="preserve">13</w:t>
-            </w:r>
-          </w:p>
-        </w:tc>
-        <w:tc>
-          <w:tcPr>
-            <w:tcW w:w="1087" w:type="dxa"/>
-            <w:vAlign w:val="center"/>
-            <w:tcBorders>
-              <w:top w:val="single" w:sz="4" w:color="000000"/>
-              <w:left w:val="single" w:sz="4" w:color="000000"/>
-              <w:bottom w:val="single" w:sz="4" w:color="000000"/>
-              <w:right w:val="single" w:sz="4" w:color="000000"/>
-            </w:tcBorders>
-            <w:tcMar>
-              <w:top w:w="28" w:type="dxa"/>
-              <w:left w:w="57" w:type="dxa"/>
-              <w:bottom w:w="28" w:type="dxa"/>
-              <w:right w:w="57" w:type="dxa"/>
-            </w:tcMar>
-          </w:tcPr>
-          <w:p>
-            <w:pPr>
-              <w:jc w:val="center"/>
-              <w:spacing w:before="0" w:after="0" w:line="240" w:lineRule="auto"/>
-            </w:pPr>
-            <w:r>
-              <w:rPr>
-                <w:rFonts w:ascii="Times New Roman" w:hAnsi="Times New Roman" w:cs="Times New Roman"/>
-                <w:sz w:val="12"/>
-                <w:szCs w:val="12"/>
-              </w:rPr>
-              <w:t xml:space="preserve">14</w:t>
             </w:r>
           </w:p>
         </w:tc>
@@ -2777,6 +2316,428 @@
       <w:tr>
         <w:trPr>
           <w:trHeight w:val="220" w:hRule="atLeast"/>
+        </w:trPr>
+        <w:tc>
+          <w:tcPr>
+            <w:tcW w:w="465" w:type="dxa"/>
+            <w:vMerge/>
+            <w:vAlign w:val="center"/>
+            <w:tcBorders>
+              <w:top w:val="single" w:sz="4" w:color="000000"/>
+              <w:left w:val="single" w:sz="4" w:color="000000"/>
+              <w:bottom w:val="single" w:sz="4" w:color="000000"/>
+              <w:right w:val="single" w:sz="4" w:color="000000"/>
+            </w:tcBorders>
+            <w:tcMar>
+              <w:top w:w="28" w:type="dxa"/>
+              <w:left w:w="57" w:type="dxa"/>
+              <w:bottom w:w="28" w:type="dxa"/>
+              <w:right w:w="57" w:type="dxa"/>
+            </w:tcMar>
+          </w:tcPr>
+          <w:p>
+            <w:pPr>
+              <w:jc w:val="left"/>
+              <w:spacing w:before="0" w:after="0" w:line="240" w:lineRule="auto"/>
+            </w:pPr>
+          </w:p>
+        </w:tc>
+        <w:tc>
+          <w:tcPr>
+            <w:tcW w:w="2795" w:type="dxa"/>
+            <w:vMerge/>
+            <w:vAlign w:val="center"/>
+            <w:tcBorders>
+              <w:top w:val="single" w:sz="4" w:color="000000"/>
+              <w:left w:val="single" w:sz="4" w:color="000000"/>
+              <w:bottom w:val="single" w:sz="4" w:color="000000"/>
+              <w:right w:val="single" w:sz="4" w:color="000000"/>
+            </w:tcBorders>
+            <w:tcMar>
+              <w:top w:w="28" w:type="dxa"/>
+              <w:left w:w="57" w:type="dxa"/>
+              <w:bottom w:w="28" w:type="dxa"/>
+              <w:right w:w="57" w:type="dxa"/>
+            </w:tcMar>
+          </w:tcPr>
+          <w:p>
+            <w:pPr>
+              <w:jc w:val="left"/>
+              <w:spacing w:before="0" w:after="0" w:line="240" w:lineRule="auto"/>
+            </w:pPr>
+          </w:p>
+        </w:tc>
+        <w:tc>
+          <w:tcPr>
+            <w:tcW w:w="465" w:type="dxa"/>
+            <w:vMerge/>
+            <w:vAlign w:val="center"/>
+            <w:tcBorders>
+              <w:top w:val="single" w:sz="4" w:color="000000"/>
+              <w:left w:val="single" w:sz="4" w:color="000000"/>
+              <w:bottom w:val="single" w:sz="4" w:color="000000"/>
+              <w:right w:val="single" w:sz="4" w:color="000000"/>
+            </w:tcBorders>
+            <w:tcMar>
+              <w:top w:w="28" w:type="dxa"/>
+              <w:left w:w="57" w:type="dxa"/>
+              <w:bottom w:w="28" w:type="dxa"/>
+              <w:right w:w="57" w:type="dxa"/>
+            </w:tcMar>
+          </w:tcPr>
+          <w:p>
+            <w:pPr>
+              <w:jc w:val="left"/>
+              <w:spacing w:before="0" w:after="0" w:line="240" w:lineRule="auto"/>
+            </w:pPr>
+          </w:p>
+        </w:tc>
+        <w:tc>
+          <w:tcPr>
+            <w:tcW w:w="776" w:type="dxa"/>
+            <w:vAlign w:val="center"/>
+            <w:tcBorders>
+              <w:top w:val="single" w:sz="4" w:color="000000"/>
+              <w:left w:val="single" w:sz="4" w:color="000000"/>
+              <w:bottom w:val="single" w:sz="4" w:color="000000"/>
+              <w:right w:val="single" w:sz="4" w:color="000000"/>
+            </w:tcBorders>
+            <w:tcMar>
+              <w:top w:w="28" w:type="dxa"/>
+              <w:left w:w="57" w:type="dxa"/>
+              <w:bottom w:w="28" w:type="dxa"/>
+              <w:right w:w="57" w:type="dxa"/>
+            </w:tcMar>
+          </w:tcPr>
+          <w:p>
+            <w:pPr>
+              <w:jc w:val="center"/>
+              <w:spacing w:before="0" w:after="0" w:line="240" w:lineRule="auto"/>
+            </w:pPr>
+            <w:r>
+              <w:rPr>
+                <w:rFonts w:ascii="Times New Roman" w:hAnsi="Times New Roman" w:cs="Times New Roman"/>
+                <w:sz w:val="12"/>
+                <w:szCs w:val="12"/>
+              </w:rPr>
+              <w:t xml:space="preserve">4</w:t>
+            </w:r>
+          </w:p>
+        </w:tc>
+        <w:tc>
+          <w:tcPr>
+            <w:tcW w:w="621" w:type="dxa"/>
+            <w:vAlign w:val="center"/>
+            <w:tcBorders>
+              <w:top w:val="single" w:sz="4" w:color="000000"/>
+              <w:left w:val="single" w:sz="4" w:color="000000"/>
+              <w:bottom w:val="single" w:sz="4" w:color="000000"/>
+              <w:right w:val="single" w:sz="4" w:color="000000"/>
+            </w:tcBorders>
+            <w:tcMar>
+              <w:top w:w="28" w:type="dxa"/>
+              <w:left w:w="57" w:type="dxa"/>
+              <w:bottom w:w="28" w:type="dxa"/>
+              <w:right w:w="57" w:type="dxa"/>
+            </w:tcMar>
+          </w:tcPr>
+          <w:p>
+            <w:pPr>
+              <w:jc w:val="center"/>
+              <w:spacing w:before="0" w:after="0" w:line="240" w:lineRule="auto"/>
+            </w:pPr>
+            <w:r>
+              <w:rPr>
+                <w:rFonts w:ascii="Times New Roman" w:hAnsi="Times New Roman" w:cs="Times New Roman"/>
+                <w:sz w:val="12"/>
+                <w:szCs w:val="12"/>
+              </w:rPr>
+              <w:t xml:space="preserve">5</w:t>
+            </w:r>
+          </w:p>
+        </w:tc>
+        <w:tc>
+          <w:tcPr>
+            <w:tcW w:w="621" w:type="dxa"/>
+            <w:vMerge/>
+            <w:vAlign w:val="center"/>
+            <w:tcBorders>
+              <w:top w:val="single" w:sz="4" w:color="000000"/>
+              <w:left w:val="single" w:sz="4" w:color="000000"/>
+              <w:bottom w:val="single" w:sz="4" w:color="000000"/>
+              <w:right w:val="single" w:sz="4" w:color="000000"/>
+            </w:tcBorders>
+            <w:tcMar>
+              <w:top w:w="28" w:type="dxa"/>
+              <w:left w:w="57" w:type="dxa"/>
+              <w:bottom w:w="28" w:type="dxa"/>
+              <w:right w:w="57" w:type="dxa"/>
+            </w:tcMar>
+          </w:tcPr>
+          <w:p>
+            <w:pPr>
+              <w:jc w:val="left"/>
+              <w:spacing w:before="0" w:after="0" w:line="240" w:lineRule="auto"/>
+            </w:pPr>
+          </w:p>
+        </w:tc>
+        <w:tc>
+          <w:tcPr>
+            <w:tcW w:w="776" w:type="dxa"/>
+            <w:vAlign w:val="center"/>
+            <w:tcBorders>
+              <w:top w:val="single" w:sz="4" w:color="000000"/>
+              <w:left w:val="single" w:sz="4" w:color="000000"/>
+              <w:bottom w:val="single" w:sz="4" w:color="000000"/>
+              <w:right w:val="single" w:sz="4" w:color="000000"/>
+            </w:tcBorders>
+            <w:tcMar>
+              <w:top w:w="28" w:type="dxa"/>
+              <w:left w:w="57" w:type="dxa"/>
+              <w:bottom w:w="28" w:type="dxa"/>
+              <w:right w:w="57" w:type="dxa"/>
+            </w:tcMar>
+          </w:tcPr>
+          <w:p>
+            <w:pPr>
+              <w:jc w:val="center"/>
+              <w:spacing w:before="0" w:after="0" w:line="240" w:lineRule="auto"/>
+            </w:pPr>
+            <w:r>
+              <w:rPr>
+                <w:rFonts w:ascii="Times New Roman" w:hAnsi="Times New Roman" w:cs="Times New Roman"/>
+                <w:sz w:val="12"/>
+                <w:szCs w:val="12"/>
+              </w:rPr>
+              <w:t xml:space="preserve">7</w:t>
+            </w:r>
+          </w:p>
+        </w:tc>
+        <w:tc>
+          <w:tcPr>
+            <w:tcW w:w="776" w:type="dxa"/>
+            <w:vAlign w:val="center"/>
+            <w:tcBorders>
+              <w:top w:val="single" w:sz="4" w:color="000000"/>
+              <w:left w:val="single" w:sz="4" w:color="000000"/>
+              <w:bottom w:val="single" w:sz="4" w:color="000000"/>
+              <w:right w:val="single" w:sz="4" w:color="000000"/>
+            </w:tcBorders>
+            <w:tcMar>
+              <w:top w:w="28" w:type="dxa"/>
+              <w:left w:w="57" w:type="dxa"/>
+              <w:bottom w:w="28" w:type="dxa"/>
+              <w:right w:w="57" w:type="dxa"/>
+            </w:tcMar>
+          </w:tcPr>
+          <w:p>
+            <w:pPr>
+              <w:jc w:val="center"/>
+              <w:spacing w:before="0" w:after="0" w:line="240" w:lineRule="auto"/>
+            </w:pPr>
+            <w:r>
+              <w:rPr>
+                <w:rFonts w:ascii="Times New Roman" w:hAnsi="Times New Roman" w:cs="Times New Roman"/>
+                <w:sz w:val="12"/>
+                <w:szCs w:val="12"/>
+              </w:rPr>
+              <w:t xml:space="preserve">8</w:t>
+            </w:r>
+          </w:p>
+        </w:tc>
+        <w:tc>
+          <w:tcPr>
+            <w:tcW w:w="776" w:type="dxa"/>
+            <w:vMerge/>
+            <w:vAlign w:val="center"/>
+            <w:tcBorders>
+              <w:top w:val="single" w:sz="4" w:color="000000"/>
+              <w:left w:val="single" w:sz="4" w:color="000000"/>
+              <w:bottom w:val="single" w:sz="4" w:color="000000"/>
+              <w:right w:val="single" w:sz="4" w:color="000000"/>
+            </w:tcBorders>
+            <w:tcMar>
+              <w:top w:w="28" w:type="dxa"/>
+              <w:left w:w="57" w:type="dxa"/>
+              <w:bottom w:w="28" w:type="dxa"/>
+              <w:right w:w="57" w:type="dxa"/>
+            </w:tcMar>
+          </w:tcPr>
+          <w:p>
+            <w:pPr>
+              <w:jc w:val="left"/>
+              <w:spacing w:before="0" w:after="0" w:line="240" w:lineRule="auto"/>
+            </w:pPr>
+          </w:p>
+        </w:tc>
+        <w:tc>
+          <w:tcPr>
+            <w:tcW w:w="776" w:type="dxa"/>
+            <w:vMerge/>
+            <w:vAlign w:val="center"/>
+            <w:tcBorders>
+              <w:top w:val="single" w:sz="4" w:color="000000"/>
+              <w:left w:val="single" w:sz="4" w:color="000000"/>
+              <w:bottom w:val="single" w:sz="4" w:color="000000"/>
+              <w:right w:val="single" w:sz="4" w:color="000000"/>
+            </w:tcBorders>
+            <w:tcMar>
+              <w:top w:w="28" w:type="dxa"/>
+              <w:left w:w="57" w:type="dxa"/>
+              <w:bottom w:w="28" w:type="dxa"/>
+              <w:right w:w="57" w:type="dxa"/>
+            </w:tcMar>
+          </w:tcPr>
+          <w:p>
+            <w:pPr>
+              <w:jc w:val="left"/>
+              <w:spacing w:before="0" w:after="0" w:line="240" w:lineRule="auto"/>
+            </w:pPr>
+          </w:p>
+        </w:tc>
+        <w:tc>
+          <w:tcPr>
+            <w:tcW w:w="931" w:type="dxa"/>
+            <w:vMerge/>
+            <w:vAlign w:val="center"/>
+            <w:tcBorders>
+              <w:top w:val="single" w:sz="4" w:color="000000"/>
+              <w:left w:val="single" w:sz="4" w:color="000000"/>
+              <w:bottom w:val="single" w:sz="4" w:color="000000"/>
+              <w:right w:val="single" w:sz="4" w:color="000000"/>
+            </w:tcBorders>
+            <w:tcMar>
+              <w:top w:w="28" w:type="dxa"/>
+              <w:left w:w="57" w:type="dxa"/>
+              <w:bottom w:w="28" w:type="dxa"/>
+              <w:right w:w="57" w:type="dxa"/>
+            </w:tcMar>
+          </w:tcPr>
+          <w:p>
+            <w:pPr>
+              <w:jc w:val="left"/>
+              <w:spacing w:before="0" w:after="0" w:line="240" w:lineRule="auto"/>
+            </w:pPr>
+          </w:p>
+        </w:tc>
+        <w:tc>
+          <w:tcPr>
+            <w:tcW w:w="1242" w:type="dxa"/>
+            <w:vMerge/>
+            <w:vAlign w:val="center"/>
+            <w:tcBorders>
+              <w:top w:val="single" w:sz="4" w:color="000000"/>
+              <w:left w:val="single" w:sz="4" w:color="000000"/>
+              <w:bottom w:val="single" w:sz="4" w:color="000000"/>
+              <w:right w:val="single" w:sz="4" w:color="000000"/>
+            </w:tcBorders>
+            <w:tcMar>
+              <w:top w:w="28" w:type="dxa"/>
+              <w:left w:w="57" w:type="dxa"/>
+              <w:bottom w:w="28" w:type="dxa"/>
+              <w:right w:w="57" w:type="dxa"/>
+            </w:tcMar>
+          </w:tcPr>
+          <w:p>
+            <w:pPr>
+              <w:jc w:val="left"/>
+              <w:spacing w:before="0" w:after="0" w:line="240" w:lineRule="auto"/>
+            </w:pPr>
+          </w:p>
+        </w:tc>
+        <w:tc>
+          <w:tcPr>
+            <w:tcW w:w="776" w:type="dxa"/>
+            <w:vAlign w:val="center"/>
+            <w:tcBorders>
+              <w:top w:val="single" w:sz="4" w:color="000000"/>
+              <w:left w:val="single" w:sz="4" w:color="000000"/>
+              <w:bottom w:val="single" w:sz="4" w:color="000000"/>
+              <w:right w:val="single" w:sz="4" w:color="000000"/>
+            </w:tcBorders>
+            <w:tcMar>
+              <w:top w:w="28" w:type="dxa"/>
+              <w:left w:w="57" w:type="dxa"/>
+              <w:bottom w:w="28" w:type="dxa"/>
+              <w:right w:w="57" w:type="dxa"/>
+            </w:tcMar>
+          </w:tcPr>
+          <w:p>
+            <w:pPr>
+              <w:jc w:val="center"/>
+              <w:spacing w:before="0" w:after="0" w:line="240" w:lineRule="auto"/>
+            </w:pPr>
+            <w:r>
+              <w:rPr>
+                <w:rFonts w:ascii="Times New Roman" w:hAnsi="Times New Roman" w:cs="Times New Roman"/>
+                <w:sz w:val="12"/>
+                <w:szCs w:val="12"/>
+              </w:rPr>
+              <w:t xml:space="preserve">13</w:t>
+            </w:r>
+          </w:p>
+        </w:tc>
+        <w:tc>
+          <w:tcPr>
+            <w:tcW w:w="1087" w:type="dxa"/>
+            <w:vAlign w:val="center"/>
+            <w:tcBorders>
+              <w:top w:val="single" w:sz="4" w:color="000000"/>
+              <w:left w:val="single" w:sz="4" w:color="000000"/>
+              <w:bottom w:val="single" w:sz="4" w:color="000000"/>
+              <w:right w:val="single" w:sz="4" w:color="000000"/>
+            </w:tcBorders>
+            <w:tcMar>
+              <w:top w:w="28" w:type="dxa"/>
+              <w:left w:w="57" w:type="dxa"/>
+              <w:bottom w:w="28" w:type="dxa"/>
+              <w:right w:w="57" w:type="dxa"/>
+            </w:tcMar>
+          </w:tcPr>
+          <w:p>
+            <w:pPr>
+              <w:jc w:val="center"/>
+              <w:spacing w:before="0" w:after="0" w:line="240" w:lineRule="auto"/>
+            </w:pPr>
+            <w:r>
+              <w:rPr>
+                <w:rFonts w:ascii="Times New Roman" w:hAnsi="Times New Roman" w:cs="Times New Roman"/>
+                <w:sz w:val="12"/>
+                <w:szCs w:val="12"/>
+              </w:rPr>
+              <w:t xml:space="preserve">14</w:t>
+            </w:r>
+          </w:p>
+        </w:tc>
+        <w:tc>
+          <w:tcPr>
+            <w:tcW w:w="2650" w:type="dxa"/>
+            <w:vMerge/>
+            <w:vAlign w:val="center"/>
+            <w:tcBorders>
+              <w:top w:val="single" w:sz="4" w:color="000000"/>
+              <w:left w:val="single" w:sz="4" w:color="000000"/>
+              <w:bottom w:val="single" w:sz="4" w:color="000000"/>
+              <w:right w:val="single" w:sz="4" w:color="000000"/>
+            </w:tcBorders>
+            <w:tcMar>
+              <w:top w:w="28" w:type="dxa"/>
+              <w:left w:w="57" w:type="dxa"/>
+              <w:bottom w:w="28" w:type="dxa"/>
+              <w:right w:w="57" w:type="dxa"/>
+            </w:tcMar>
+          </w:tcPr>
+          <w:p>
+            <w:pPr>
+              <w:jc w:val="left"/>
+              <w:spacing w:before="0" w:after="0" w:line="240" w:lineRule="auto"/>
+            </w:pPr>
+          </w:p>
+        </w:tc>
+      </w:tr>
+      <w:tr>
+        <w:trPr>
+          <w:trHeight w:val="200" w:hRule="atLeast"/>
         </w:trPr>
         <w:tc>
           <w:tcPr>
@@ -4131,6 +4092,12 @@
         <w:t xml:space="preserve">{{AMOUNT_WORDS}}</w:t>
       </w:r>
     </w:p>
+    <w:p>
+      <w:pPr>
+        <w:jc w:val="left"/>
+        <w:spacing w:before="0" w:after="20" w:line="240" w:lineRule="auto"/>
+      </w:pPr>
+    </w:p>
     <w:tbl>
       <w:tblPr>
         <w:tblW w:w="15533" w:type="dxa"/>
@@ -4440,7 +4407,7 @@
   <w:docDefaults>
     <w:rPrDefault>
       <w:rPr>
-        <w:rFonts w:ascii="Times New Roman" w:eastAsia="Times New Roman" w:hAnsi="Times New Roman" w:cs="Times New Roman"/>
+        <w:rFonts w:ascii="Times New Roman" w:hAnsi="Times New Roman" w:cs="Times New Roman"/>
         <w:sz w:val="16"/>
         <w:szCs w:val="16"/>
         <w:lang w:val="ru-RU" w:eastAsia="ru-RU" w:bidi="ar-SA"/>

</xml_diff>

<commit_message>
fix: remove Table 4 (Всего мест/Масса груза) from TTN template — was showing on second page with empty cells
Co-authored-by: Rekhmunov <Rekhmunov@users.noreply.github.com>
</commit_message>
<xml_diff>
--- a/web_static/torg12_tpl.docx
+++ b/web_static/torg12_tpl.docx
@@ -4069,354 +4069,6 @@
         <w:t>прописью</w:t>
       </w:r>
     </w:p>
-    <w:tbl>
-      <w:tblPr>
-        <w:tblW w:w="15704" w:type="dxa"/>
-        <w:jc w:val="start"/>
-        <w:tblInd w:w="0" w:type="dxa"/>
-        <w:tblLayout w:type="fixed"/>
-        <w:tblCellMar>
-          <w:top w:w="0" w:type="dxa"/>
-          <w:start w:w="0" w:type="dxa"/>
-          <w:bottom w:w="0" w:type="dxa"/>
-          <w:end w:w="0" w:type="dxa"/>
-        </w:tblCellMar>
-      </w:tblPr>
-      <w:tblGrid>
-        <w:gridCol w:w="1418"/>
-        <w:gridCol w:w="2268"/>
-        <w:gridCol w:w="1985"/>
-        <w:gridCol w:w="7085"/>
-        <w:gridCol w:w="113"/>
-        <w:gridCol w:w="2835"/>
-      </w:tblGrid>
-      <w:tr>
-        <w:trPr>
-          <w:trHeight w:val="397" w:hRule="atLeast"/>
-        </w:trPr>
-        <w:tc>
-          <w:tcPr>
-            <w:tcW w:w="1418" w:type="dxa"/>
-            <w:vMerge w:val="restart"/>
-            <w:tcBorders>
-              <w:bottom w:val="single" w:sz="4" w:space="0" w:color="000000"/>
-            </w:tcBorders>
-            <w:vAlign w:val="bottom"/>
-          </w:tcPr>
-          <w:p>
-            <w:pPr>
-              <w:pStyle w:val="Normal"/>
-              <w:jc w:val="center"/>
-              <w:rPr>
-                <w:sz w:val="18"/>
-                <w:szCs w:val="18"/>
-              </w:rPr>
-            </w:pPr>
-            <w:r>
-              <w:rPr>
-                <w:sz w:val="18"/>
-                <w:szCs w:val="18"/>
-              </w:rPr>
-              <w:t>Всего мест</w:t>
-            </w:r>
-          </w:p>
-        </w:tc>
-        <w:tc>
-          <w:tcPr>
-            <w:tcW w:w="2268" w:type="dxa"/>
-            <w:vMerge w:val="restart"/>
-            <w:tcBorders>
-              <w:bottom w:val="single" w:sz="4" w:space="0" w:color="000000"/>
-            </w:tcBorders>
-            <w:vAlign w:val="center"/>
-          </w:tcPr>
-          <w:p>
-            <w:pPr>
-              <w:pStyle w:val="Normal"/>
-              <w:snapToGrid w:val="false"/>
-              <w:jc w:val="center"/>
-              <w:rPr>
-                <w:sz w:val="18"/>
-                <w:szCs w:val="18"/>
-              </w:rPr>
-            </w:pPr>
-            <w:r>
-              <w:rPr>
-                <w:sz w:val="18"/>
-                <w:szCs w:val="18"/>
-              </w:rPr>
-            </w:r>
-          </w:p>
-        </w:tc>
-        <w:tc>
-          <w:tcPr>
-            <w:tcW w:w="1985" w:type="dxa"/>
-            <w:tcBorders/>
-            <w:vAlign w:val="bottom"/>
-          </w:tcPr>
-          <w:p>
-            <w:pPr>
-              <w:pStyle w:val="Normal"/>
-              <w:ind w:start="113" w:end="113"/>
-              <w:rPr>
-                <w:sz w:val="18"/>
-                <w:szCs w:val="18"/>
-              </w:rPr>
-            </w:pPr>
-            <w:r>
-              <w:rPr>
-                <w:sz w:val="18"/>
-                <w:szCs w:val="18"/>
-              </w:rPr>
-              <w:t>Масса груза( нетто)</w:t>
-            </w:r>
-          </w:p>
-        </w:tc>
-        <w:tc>
-          <w:tcPr>
-            <w:tcW w:w="7085" w:type="dxa"/>
-            <w:tcBorders>
-              <w:bottom w:val="single" w:sz="4" w:space="0" w:color="000000"/>
-            </w:tcBorders>
-            <w:vAlign w:val="center"/>
-          </w:tcPr>
-          <w:p>
-            <w:pPr>
-              <w:pStyle w:val="Normal"/>
-              <w:snapToGrid w:val="false"/>
-              <w:jc w:val="center"/>
-              <w:rPr>
-                <w:sz w:val="18"/>
-                <w:szCs w:val="18"/>
-              </w:rPr>
-            </w:pPr>
-            <w:r>
-              <w:rPr>
-                <w:sz w:val="18"/>
-                <w:szCs w:val="18"/>
-              </w:rPr>
-            </w:r>
-          </w:p>
-        </w:tc>
-        <w:tc>
-          <w:tcPr>
-            <w:tcW w:w="113" w:type="dxa"/>
-            <w:tcBorders>
-              <w:end w:val="single" w:sz="4" w:space="0" w:color="000000"/>
-            </w:tcBorders>
-          </w:tcPr>
-          <w:p>
-            <w:pPr>
-              <w:pStyle w:val="Normal"/>
-              <w:snapToGrid w:val="false"/>
-              <w:jc w:val="center"/>
-              <w:rPr>
-                <w:sz w:val="18"/>
-                <w:szCs w:val="18"/>
-              </w:rPr>
-            </w:pPr>
-            <w:r>
-              <w:rPr>
-                <w:sz w:val="18"/>
-                <w:szCs w:val="18"/>
-              </w:rPr>
-            </w:r>
-          </w:p>
-        </w:tc>
-        <w:tc>
-          <w:tcPr>
-            <w:tcW w:w="2835" w:type="dxa"/>
-            <w:tcBorders>
-              <w:top w:val="single" w:sz="4" w:space="0" w:color="000000"/>
-              <w:start w:val="single" w:sz="4" w:space="0" w:color="000000"/>
-              <w:bottom w:val="single" w:sz="4" w:space="0" w:color="000000"/>
-              <w:end w:val="single" w:sz="4" w:space="0" w:color="000000"/>
-            </w:tcBorders>
-            <w:vAlign w:val="center"/>
-          </w:tcPr>
-          <w:p>
-            <w:pPr>
-              <w:pStyle w:val="Normal"/>
-              <w:snapToGrid w:val="false"/>
-              <w:jc w:val="center"/>
-              <w:rPr>
-                <w:sz w:val="18"/>
-                <w:szCs w:val="18"/>
-              </w:rPr>
-            </w:pPr>
-            <w:r>
-              <w:rPr>
-                <w:sz w:val="18"/>
-                <w:szCs w:val="18"/>
-              </w:rPr>
-            </w:r>
-          </w:p>
-        </w:tc>
-      </w:tr>
-      <w:tr>
-        <w:trPr>
-          <w:trHeight w:val="397" w:hRule="atLeast"/>
-        </w:trPr>
-        <w:tc>
-          <w:tcPr>
-            <w:tcW w:w="1418" w:type="dxa"/>
-            <w:vMerge w:val="continue"/>
-            <w:tcBorders>
-              <w:bottom w:val="single" w:sz="4" w:space="0" w:color="000000"/>
-            </w:tcBorders>
-            <w:vAlign w:val="bottom"/>
-          </w:tcPr>
-          <w:p>
-            <w:pPr>
-              <w:pStyle w:val="Normal"/>
-              <w:snapToGrid w:val="false"/>
-              <w:jc w:val="center"/>
-              <w:rPr>
-                <w:sz w:val="18"/>
-                <w:szCs w:val="18"/>
-              </w:rPr>
-            </w:pPr>
-            <w:r>
-              <w:rPr>
-                <w:sz w:val="18"/>
-                <w:szCs w:val="18"/>
-              </w:rPr>
-            </w:r>
-          </w:p>
-        </w:tc>
-        <w:tc>
-          <w:tcPr>
-            <w:tcW w:w="2268" w:type="dxa"/>
-            <w:vMerge w:val="continue"/>
-            <w:tcBorders>
-              <w:bottom w:val="single" w:sz="4" w:space="0" w:color="000000"/>
-            </w:tcBorders>
-            <w:vAlign w:val="center"/>
-          </w:tcPr>
-          <w:p>
-            <w:pPr>
-              <w:pStyle w:val="Normal"/>
-              <w:snapToGrid w:val="false"/>
-              <w:jc w:val="center"/>
-              <w:rPr>
-                <w:sz w:val="18"/>
-                <w:szCs w:val="18"/>
-              </w:rPr>
-            </w:pPr>
-            <w:r>
-              <w:rPr>
-                <w:sz w:val="18"/>
-                <w:szCs w:val="18"/>
-              </w:rPr>
-            </w:r>
-          </w:p>
-        </w:tc>
-        <w:tc>
-          <w:tcPr>
-            <w:tcW w:w="1985" w:type="dxa"/>
-            <w:tcBorders/>
-            <w:vAlign w:val="bottom"/>
-          </w:tcPr>
-          <w:p>
-            <w:pPr>
-              <w:pStyle w:val="Normal"/>
-              <w:ind w:start="113" w:end="113"/>
-              <w:rPr>
-                <w:sz w:val="18"/>
-                <w:szCs w:val="18"/>
-              </w:rPr>
-            </w:pPr>
-            <w:r>
-              <w:rPr>
-                <w:sz w:val="18"/>
-                <w:szCs w:val="18"/>
-              </w:rPr>
-              <w:t>Масса груза (брутто)</w:t>
-            </w:r>
-          </w:p>
-        </w:tc>
-        <w:tc>
-          <w:tcPr>
-            <w:tcW w:w="7085" w:type="dxa"/>
-            <w:tcBorders>
-              <w:top w:val="single" w:sz="4" w:space="0" w:color="000000"/>
-              <w:bottom w:val="single" w:sz="4" w:space="0" w:color="000000"/>
-            </w:tcBorders>
-          </w:tcPr>
-          <w:p>
-            <w:pPr>
-              <w:pStyle w:val="Normal"/>
-              <w:jc w:val="center"/>
-              <w:rPr>
-                <w:sz w:val="18"/>
-                <w:szCs w:val="18"/>
-              </w:rPr>
-            </w:pPr>
-            <w:r>
-              <w:rPr>
-                <w:sz w:val="14"/>
-                <w:szCs w:val="14"/>
-              </w:rPr>
-              <w:t>прописью</w:t>
-            </w:r>
-          </w:p>
-        </w:tc>
-        <w:tc>
-          <w:tcPr>
-            <w:tcW w:w="113" w:type="dxa"/>
-            <w:tcBorders>
-              <w:end w:val="single" w:sz="4" w:space="0" w:color="000000"/>
-            </w:tcBorders>
-          </w:tcPr>
-          <w:p>
-            <w:pPr>
-              <w:pStyle w:val="Normal"/>
-              <w:snapToGrid w:val="false"/>
-              <w:jc w:val="center"/>
-              <w:rPr>
-                <w:sz w:val="18"/>
-                <w:szCs w:val="18"/>
-              </w:rPr>
-            </w:pPr>
-            <w:r>
-              <w:rPr>
-                <w:sz w:val="18"/>
-                <w:szCs w:val="18"/>
-              </w:rPr>
-            </w:r>
-          </w:p>
-        </w:tc>
-        <w:tc>
-          <w:tcPr>
-            <w:tcW w:w="2835" w:type="dxa"/>
-            <w:tcBorders>
-              <w:top w:val="single" w:sz="4" w:space="0" w:color="000000"/>
-              <w:start w:val="single" w:sz="4" w:space="0" w:color="000000"/>
-              <w:bottom w:val="single" w:sz="4" w:space="0" w:color="000000"/>
-              <w:end w:val="single" w:sz="4" w:space="0" w:color="000000"/>
-            </w:tcBorders>
-            <w:vAlign w:val="center"/>
-          </w:tcPr>
-          <w:p>
-            <w:pPr>
-              <w:pStyle w:val="Normal"/>
-              <w:snapToGrid w:val="false"/>
-              <w:jc w:val="center"/>
-              <w:rPr>
-                <w:sz w:val="18"/>
-                <w:szCs w:val="18"/>
-              </w:rPr>
-            </w:pPr>
-            <w:r>
-              <w:rPr>
-                <w:sz w:val="18"/>
-                <w:szCs w:val="18"/>
-              </w:rPr>
-            </w:r>
-          </w:p>
-        </w:tc>
-      </w:tr>
-    </w:tbl>
     <w:p>
       <w:pPr>
         <w:pStyle w:val="Normal"/>

</xml_diff>

<commit_message>
fix: remove Итого row from TTN goods table, data row goes directly to Всего по накладной
Co-authored-by: Rekhmunov <Rekhmunov@users.noreply.github.com>
</commit_message>
<xml_diff>
--- a/web_static/torg12_tpl.docx
+++ b/web_static/torg12_tpl.docx
@@ -3461,272 +3461,6 @@
                 <w:bCs/>
               </w:rPr>
               <w:t xml:space="preserve">{{AMOUNT}}</w:t>
-            </w:r>
-          </w:p>
-        </w:tc>
-        <w:tc>
-          <w:tcPr>
-            <w:tcW w:w="1418" w:type="dxa"/>
-            <w:tcBorders>
-              <w:top w:val="single" w:sz="4" w:space="0" w:color="000000"/>
-              <w:start w:val="single" w:sz="4" w:space="0" w:color="000000"/>
-              <w:bottom w:val="single" w:sz="4" w:space="0" w:color="000000"/>
-              <w:end w:val="single" w:sz="4" w:space="0" w:color="000000"/>
-            </w:tcBorders>
-            <w:vAlign w:val="center"/>
-          </w:tcPr>
-          <w:p>
-            <w:pPr>
-              <w:pStyle w:val="Normal"/>
-              <w:snapToGrid w:val="false"/>
-              <w:jc w:val="center"/>
-              <w:rPr>
-                <w:sz w:val="18"/>
-                <w:szCs w:val="18"/>
-              </w:rPr>
-            </w:pPr>
-            <w:r>
-              <w:rPr>
-                <w:sz w:val="18"/>
-                <w:szCs w:val="18"/>
-              </w:rPr>
-            </w:r>
-          </w:p>
-        </w:tc>
-      </w:tr>
-      <w:tr>
-        <w:trPr>
-          <w:trHeight w:val="397" w:hRule="exact"/>
-        </w:trPr>
-        <w:tc>
-          <w:tcPr>
-            <w:tcW w:w="7373" w:type="dxa"/>
-            <w:gridSpan w:val="7"/>
-            <w:tcBorders>
-              <w:top w:val="single" w:sz="4" w:space="0" w:color="000000"/>
-              <w:end w:val="single" w:sz="4" w:space="0" w:color="000000"/>
-            </w:tcBorders>
-            <w:vAlign w:val="center"/>
-          </w:tcPr>
-          <w:p>
-            <w:pPr>
-              <w:pStyle w:val="Normal"/>
-              <w:ind w:end="113"/>
-              <w:jc w:val="end"/>
-              <w:rPr>
-                <w:sz w:val="18"/>
-                <w:szCs w:val="18"/>
-              </w:rPr>
-            </w:pPr>
-            <w:r>
-              <w:rPr>
-                <w:sz w:val="18"/>
-                <w:szCs w:val="18"/>
-              </w:rPr>
-              <w:t>Итого</w:t>
-            </w:r>
-          </w:p>
-        </w:tc>
-        <w:tc>
-          <w:tcPr>
-            <w:tcW w:w="737" w:type="dxa"/>
-            <w:tcBorders>
-              <w:top w:val="single" w:sz="4" w:space="0" w:color="000000"/>
-              <w:start w:val="single" w:sz="4" w:space="0" w:color="000000"/>
-              <w:bottom w:val="single" w:sz="4" w:space="0" w:color="000000"/>
-              <w:end w:val="single" w:sz="4" w:space="0" w:color="000000"/>
-            </w:tcBorders>
-            <w:vAlign w:val="center"/>
-          </w:tcPr>
-          <w:p>
-            <w:pPr>
-              <w:pStyle w:val="Normal"/>
-              <w:snapToGrid w:val="false"/>
-              <w:jc w:val="center"/>
-              <w:rPr>
-                <w:sz w:val="18"/>
-                <w:szCs w:val="18"/>
-              </w:rPr>
-            </w:pPr>
-            <w:r>
-              <w:rPr>
-                <w:sz w:val="18"/>
-                <w:szCs w:val="18"/>
-              </w:rPr>
-            </w:r>
-          </w:p>
-        </w:tc>
-        <w:tc>
-          <w:tcPr>
-            <w:tcW w:w="737" w:type="dxa"/>
-            <w:tcBorders>
-              <w:top w:val="single" w:sz="4" w:space="0" w:color="000000"/>
-              <w:start w:val="single" w:sz="4" w:space="0" w:color="000000"/>
-              <w:bottom w:val="single" w:sz="4" w:space="0" w:color="000000"/>
-              <w:end w:val="single" w:sz="4" w:space="0" w:color="000000"/>
-            </w:tcBorders>
-            <w:vAlign w:val="center"/>
-          </w:tcPr>
-          <w:p>
-            <w:pPr>
-              <w:pStyle w:val="Normal"/>
-              <w:snapToGrid w:val="false"/>
-              <w:jc w:val="center"/>
-              <w:rPr>
-                <w:sz w:val="18"/>
-                <w:szCs w:val="18"/>
-              </w:rPr>
-            </w:pPr>
-            <w:r>
-              <w:rPr>
-                <w:sz w:val="18"/>
-                <w:szCs w:val="18"/>
-              </w:rPr>
-            </w:r>
-          </w:p>
-        </w:tc>
-        <w:tc>
-          <w:tcPr>
-            <w:tcW w:w="737" w:type="dxa"/>
-            <w:tcBorders>
-              <w:top w:val="single" w:sz="4" w:space="0" w:color="000000"/>
-              <w:start w:val="single" w:sz="4" w:space="0" w:color="000000"/>
-              <w:bottom w:val="single" w:sz="4" w:space="0" w:color="000000"/>
-              <w:end w:val="single" w:sz="4" w:space="0" w:color="000000"/>
-            </w:tcBorders>
-            <w:vAlign w:val="center"/>
-          </w:tcPr>
-          <w:p>
-            <w:pPr>
-              <w:pStyle w:val="Normal"/>
-              <w:snapToGrid w:val="false"/>
-              <w:jc w:val="center"/>
-              <w:rPr>
-                <w:sz w:val="18"/>
-                <w:szCs w:val="18"/>
-              </w:rPr>
-            </w:pPr>
-            <w:r>
-              <w:rPr>
-                <w:sz w:val="18"/>
-                <w:szCs w:val="18"/>
-              </w:rPr>
-            </w:r>
-          </w:p>
-        </w:tc>
-        <w:tc>
-          <w:tcPr>
-            <w:tcW w:w="1134" w:type="dxa"/>
-            <w:tcBorders>
-              <w:top w:val="single" w:sz="4" w:space="0" w:color="000000"/>
-              <w:start w:val="single" w:sz="4" w:space="0" w:color="000000"/>
-              <w:bottom w:val="single" w:sz="4" w:space="0" w:color="000000"/>
-              <w:end w:val="single" w:sz="4" w:space="0" w:color="000000"/>
-            </w:tcBorders>
-            <w:vAlign w:val="center"/>
-          </w:tcPr>
-          <w:p>
-            <w:pPr>
-              <w:pStyle w:val="Normal"/>
-              <w:jc w:val="center"/>
-              <w:rPr>
-                <w:sz w:val="18"/>
-                <w:szCs w:val="18"/>
-              </w:rPr>
-            </w:pPr>
-            <w:r>
-              <w:rPr>
-                <w:sz w:val="18"/>
-                <w:szCs w:val="18"/>
-              </w:rPr>
-              <w:t>Х</w:t>
-            </w:r>
-          </w:p>
-        </w:tc>
-        <w:tc>
-          <w:tcPr>
-            <w:tcW w:w="1418" w:type="dxa"/>
-            <w:tcBorders>
-              <w:top w:val="single" w:sz="4" w:space="0" w:color="000000"/>
-              <w:start w:val="single" w:sz="4" w:space="0" w:color="000000"/>
-              <w:bottom w:val="single" w:sz="4" w:space="0" w:color="000000"/>
-              <w:end w:val="single" w:sz="4" w:space="0" w:color="000000"/>
-            </w:tcBorders>
-            <w:vAlign w:val="center"/>
-          </w:tcPr>
-          <w:p>
-            <w:pPr>
-              <w:pStyle w:val="Normal"/>
-              <w:snapToGrid w:val="false"/>
-              <w:jc w:val="center"/>
-              <w:rPr>
-                <w:sz w:val="18"/>
-                <w:szCs w:val="18"/>
-              </w:rPr>
-            </w:pPr>
-            <w:r>
-              <w:rPr>
-                <w:sz w:val="18"/>
-                <w:szCs w:val="18"/>
-              </w:rPr>
-            </w:r>
-          </w:p>
-        </w:tc>
-        <w:tc>
-          <w:tcPr>
-            <w:tcW w:w="737" w:type="dxa"/>
-            <w:tcBorders>
-              <w:top w:val="single" w:sz="4" w:space="0" w:color="000000"/>
-              <w:start w:val="single" w:sz="4" w:space="0" w:color="000000"/>
-              <w:bottom w:val="single" w:sz="4" w:space="0" w:color="000000"/>
-              <w:end w:val="single" w:sz="4" w:space="0" w:color="000000"/>
-            </w:tcBorders>
-            <w:vAlign w:val="center"/>
-          </w:tcPr>
-          <w:p>
-            <w:pPr>
-              <w:pStyle w:val="Normal"/>
-              <w:jc w:val="center"/>
-              <w:rPr>
-                <w:sz w:val="18"/>
-                <w:szCs w:val="18"/>
-              </w:rPr>
-            </w:pPr>
-            <w:r>
-              <w:rPr>
-                <w:sz w:val="18"/>
-                <w:szCs w:val="18"/>
-              </w:rPr>
-              <w:t>Х</w:t>
-            </w:r>
-          </w:p>
-        </w:tc>
-        <w:tc>
-          <w:tcPr>
-            <w:tcW w:w="1418" w:type="dxa"/>
-            <w:tcBorders>
-              <w:top w:val="single" w:sz="4" w:space="0" w:color="000000"/>
-              <w:start w:val="single" w:sz="4" w:space="0" w:color="000000"/>
-              <w:bottom w:val="single" w:sz="4" w:space="0" w:color="000000"/>
-              <w:end w:val="single" w:sz="4" w:space="0" w:color="000000"/>
-            </w:tcBorders>
-            <w:vAlign w:val="center"/>
-          </w:tcPr>
-          <w:p>
-            <w:pPr>
-              <w:pStyle w:val="Normal"/>
-              <w:snapToGrid w:val="false"/>
-              <w:jc w:val="center"/>
-              <w:rPr>
-                <w:sz w:val="18"/>
-                <w:szCs w:val="18"/>
-              </w:rPr>
-            </w:pPr>
-            <w:r>
-              <w:rPr>
-                <w:sz w:val="18"/>
-                <w:szCs w:val="18"/>
-              </w:rPr>
             </w:r>
           </w:p>
         </w:tc>

</xml_diff>

<commit_message>
fix: expand Поставщик and Плательщик row height in TTN (340→680 twip, atLeast) for 2-line text
Co-authored-by: Rekhmunov <Rekhmunov@users.noreply.github.com>
</commit_message>
<xml_diff>
--- a/web_static/torg12_tpl.docx
+++ b/web_static/torg12_tpl.docx
@@ -534,7 +534,7 @@
       </w:tr>
       <w:tr>
         <w:trPr>
-          <w:trHeight w:val="340" w:hRule="exact"/>
+          <w:trHeight w:val="680" w:hRule="atLeast"/>
         </w:trPr>
         <w:tc>
           <w:tcPr>
@@ -634,7 +634,7 @@
       </w:tr>
       <w:tr>
         <w:trPr>
-          <w:trHeight w:val="340" w:hRule="exact"/>
+          <w:trHeight w:val="680" w:hRule="atLeast"/>
         </w:trPr>
         <w:tc>
           <w:tcPr>

</xml_diff>

<commit_message>
fix: reduce TTN margins/line-spacing/row-heights to fit on single page
Co-authored-by: Rekhmunov <Rekhmunov@users.noreply.github.com>
</commit_message>
<xml_diff>
--- a/web_static/torg12_tpl.docx
+++ b/web_static/torg12_tpl.docx
@@ -534,7 +534,7 @@
       </w:tr>
       <w:tr>
         <w:trPr>
-          <w:trHeight w:val="680" w:hRule="atLeast"/>
+          <w:trHeight w:val="560" w:hRule="atLeast"/>
         </w:trPr>
         <w:tc>
           <w:tcPr>
@@ -634,7 +634,7 @@
       </w:tr>
       <w:tr>
         <w:trPr>
-          <w:trHeight w:val="680" w:hRule="atLeast"/>
+          <w:trHeight w:val="560" w:hRule="atLeast"/>
         </w:trPr>
         <w:tc>
           <w:tcPr>
@@ -3755,7 +3755,7 @@
     <w:p>
       <w:pPr>
         <w:pStyle w:val="Normal"/>
-        <w:spacing w:lineRule="auto" w:line="360" w:before="120" w:after="0"/>
+        <w:spacing w:lineRule="auto" w:line="280" w:before="60" w:after="0"/>
         <w:rPr>
           <w:szCs w:val="20"/>
         </w:rPr>
@@ -3806,7 +3806,7 @@
     <w:p>
       <w:pPr>
         <w:pStyle w:val="Normal"/>
-        <w:spacing w:lineRule="auto" w:line="360"/>
+        <w:spacing w:lineRule="auto" w:line="280"/>
         <w:rPr>
           <w:sz w:val="14"/>
           <w:szCs w:val="14"/>
@@ -3887,7 +3887,7 @@
           <w:p>
             <w:pPr>
               <w:pStyle w:val="Normal"/>
-              <w:spacing w:lineRule="auto" w:line="360"/>
+              <w:spacing w:lineRule="auto" w:line="280"/>
               <w:ind w:start="57" w:end="57"/>
               <w:rPr/>
             </w:pPr>
@@ -3938,7 +3938,7 @@
           <w:p>
             <w:pPr>
               <w:pStyle w:val="Normal"/>
-              <w:spacing w:lineRule="auto" w:line="360"/>
+              <w:spacing w:lineRule="auto" w:line="280"/>
               <w:ind w:start="57" w:end="57"/>
               <w:rPr/>
             </w:pPr>
@@ -3967,7 +3967,7 @@
           <w:p>
             <w:pPr>
               <w:pStyle w:val="Normal"/>
-              <w:spacing w:lineRule="auto" w:line="360"/>
+              <w:spacing w:lineRule="auto" w:line="280"/>
               <w:ind w:start="57" w:end="57"/>
               <w:rPr>
                 <w:sz w:val="16"/>
@@ -4018,7 +4018,7 @@
           <w:p>
             <w:pPr>
               <w:pStyle w:val="Normal"/>
-              <w:spacing w:lineRule="auto" w:line="360"/>
+              <w:spacing w:lineRule="auto" w:line="280"/>
               <w:ind w:start="57" w:end="57"/>
               <w:rPr/>
             </w:pPr>
@@ -4118,7 +4118,7 @@
           <w:p>
             <w:pPr>
               <w:pStyle w:val="Normal"/>
-              <w:spacing w:lineRule="auto" w:line="360"/>
+              <w:spacing w:lineRule="auto" w:line="280"/>
               <w:ind w:start="57" w:end="57"/>
               <w:rPr>
                 <w:szCs w:val="20"/>
@@ -4149,7 +4149,7 @@
           <w:p>
             <w:pPr>
               <w:pStyle w:val="Normal"/>
-              <w:spacing w:lineRule="auto" w:line="360"/>
+              <w:spacing w:lineRule="auto" w:line="280"/>
               <w:ind w:start="57" w:end="57"/>
               <w:rPr>
                 <w:sz w:val="16"/>
@@ -4174,7 +4174,7 @@
           <w:p>
             <w:pPr>
               <w:pStyle w:val="Normal"/>
-              <w:spacing w:lineRule="auto" w:line="360"/>
+              <w:spacing w:lineRule="auto" w:line="280"/>
               <w:ind w:start="57" w:end="57"/>
               <w:rPr>
                 <w:szCs w:val="20"/>
@@ -4217,7 +4217,7 @@
           <w:p>
             <w:pPr>
               <w:pStyle w:val="Normal"/>
-              <w:spacing w:lineRule="auto" w:line="360"/>
+              <w:spacing w:lineRule="auto" w:line="280"/>
               <w:ind w:start="57" w:end="57"/>
               <w:rPr>
                 <w:sz w:val="16"/>
@@ -4265,7 +4265,7 @@
           <w:p>
             <w:pPr>
               <w:pStyle w:val="Normal"/>
-              <w:spacing w:lineRule="auto" w:line="360"/>
+              <w:spacing w:lineRule="auto" w:line="280"/>
               <w:ind w:start="57" w:end="57"/>
               <w:rPr/>
             </w:pPr>
@@ -4324,7 +4324,7 @@
     <w:sectPr>
       <w:type w:val="nextPage"/>
       <w:pgSz w:orient="landscape" w:w="16838" w:h="11906"/>
-      <w:pgMar w:left="567" w:right="567" w:gutter="0" w:header="0" w:top="567" w:footer="0" w:bottom="567"/>
+      <w:pgMar w:left="567" w:right="567" w:gutter="0" w:header="0" w:top="400" w:footer="0" w:bottom="400"/>
       <w:pgNumType w:fmt="decimal"/>
       <w:formProt w:val="false"/>
       <w:textDirection w:val="lrTb"/>

</xml_diff>

<commit_message>
feat: add VAT 22% to TTN — rate column, VAT sum, total with VAT calculated in JS
Co-authored-by: Rekhmunov <Rekhmunov@users.noreply.github.com>
</commit_message>
<xml_diff>
--- a/web_static/torg12_tpl.docx
+++ b/web_static/torg12_tpl.docx
@@ -3255,6 +3255,7 @@
           </w:tcPr>
           <w:p>
             <w:pPr>
+              <w:jc w:val="center"/>
               <w:spacing w:before="0" w:after="0"/>
             </w:pPr>
             <w:r>
@@ -3263,7 +3264,7 @@
                 <w:sz w:val="16"/>
                 <w:szCs w:val="16"/>
               </w:rPr>
-              <w:t xml:space="preserve">Без НДС</w:t>
+              <w:t xml:space="preserve">22%</w:t>
             </w:r>
           </w:p>
         </w:tc>
@@ -3280,19 +3281,18 @@
           </w:tcPr>
           <w:p>
             <w:pPr>
-              <w:pStyle w:val="Normal"/>
-              <w:snapToGrid w:val="false"/>
-              <w:jc w:val="center"/>
-              <w:rPr>
-                <w:sz w:val="18"/>
-                <w:szCs w:val="18"/>
-              </w:rPr>
-            </w:pPr>
-            <w:r>
-              <w:rPr>
-                <w:sz w:val="18"/>
-                <w:szCs w:val="18"/>
-              </w:rPr>
+              <w:jc w:val="center"/>
+              <w:spacing w:before="0" w:after="0"/>
+            </w:pPr>
+            <w:r>
+              <w:rPr>
+                <w:rFonts w:ascii="Times New Roman" w:hAnsi="Times New Roman" w:cs="Times New Roman"/>
+                <w:sz w:val="18"/>
+                <w:szCs w:val="18"/>
+                <w:b/>
+                <w:bCs/>
+              </w:rPr>
+              <w:t xml:space="preserve">{{VAT_SUM}}</w:t>
             </w:r>
           </w:p>
         </w:tc>
@@ -3394,6 +3394,7 @@
           </w:tcPr>
           <w:p>
             <w:pPr>
+              <w:jc w:val="center"/>
               <w:spacing w:before="0" w:after="0"/>
             </w:pPr>
             <w:r>
@@ -3404,7 +3405,7 @@
                 <w:b/>
                 <w:bCs/>
               </w:rPr>
-              <w:t xml:space="preserve">{{AMOUNT}}</w:t>
+              <w:t xml:space="preserve">{{AMOUNT_WITH_VAT}}</w:t>
             </w:r>
           </w:p>
         </w:tc>
@@ -3450,6 +3451,7 @@
           </w:tcPr>
           <w:p>
             <w:pPr>
+              <w:jc w:val="center"/>
               <w:spacing w:before="0" w:after="0"/>
             </w:pPr>
             <w:r>
@@ -3460,7 +3462,7 @@
                 <w:b/>
                 <w:bCs/>
               </w:rPr>
-              <w:t xml:space="preserve">{{AMOUNT}}</w:t>
+              <w:t xml:space="preserve">{{AMOUNT_WITH_VAT}}</w:t>
             </w:r>
           </w:p>
         </w:tc>
@@ -3678,19 +3680,18 @@
           </w:tcPr>
           <w:p>
             <w:pPr>
-              <w:pStyle w:val="Normal"/>
-              <w:jc w:val="center"/>
-              <w:rPr>
-                <w:sz w:val="18"/>
-                <w:szCs w:val="18"/>
-              </w:rPr>
-            </w:pPr>
-            <w:r>
-              <w:rPr>
-                <w:sz w:val="18"/>
-                <w:szCs w:val="18"/>
-              </w:rPr>
-              <w:t>Х</w:t>
+              <w:jc w:val="center"/>
+              <w:spacing w:before="0" w:after="0"/>
+            </w:pPr>
+            <w:r>
+              <w:rPr>
+                <w:rFonts w:ascii="Times New Roman" w:hAnsi="Times New Roman" w:cs="Times New Roman"/>
+                <w:sz w:val="18"/>
+                <w:szCs w:val="18"/>
+                <w:b/>
+                <w:bCs/>
+              </w:rPr>
+              <w:t xml:space="preserve">{{VAT_SUM}}</w:t>
             </w:r>
           </w:p>
         </w:tc>

</xml_diff>

<commit_message>
fix: TTN goods row — В одном месте=1 (cell 6), move 22% to НДС ставка column
Co-authored-by: Rekhmunov <Rekhmunov@users.noreply.github.com>
</commit_message>
<xml_diff>
--- a/web_static/torg12_tpl.docx
+++ b/web_static/torg12_tpl.docx
@@ -3264,7 +3264,7 @@
                 <w:sz w:val="16"/>
                 <w:szCs w:val="16"/>
               </w:rPr>
-              <w:t xml:space="preserve">22%</w:t>
+              <w:t xml:space="preserve">1</w:t>
             </w:r>
           </w:p>
         </w:tc>
@@ -3309,19 +3309,16 @@
           </w:tcPr>
           <w:p>
             <w:pPr>
-              <w:pStyle w:val="Normal"/>
-              <w:snapToGrid w:val="false"/>
-              <w:jc w:val="center"/>
-              <w:rPr>
-                <w:sz w:val="18"/>
-                <w:szCs w:val="18"/>
-              </w:rPr>
-            </w:pPr>
-            <w:r>
-              <w:rPr>
-                <w:sz w:val="18"/>
-                <w:szCs w:val="18"/>
-              </w:rPr>
+              <w:jc w:val="center"/>
+              <w:spacing w:before="0" w:after="0"/>
+            </w:pPr>
+            <w:r>
+              <w:rPr>
+                <w:rFonts w:ascii="Times New Roman" w:hAnsi="Times New Roman" w:cs="Times New Roman"/>
+                <w:sz w:val="18"/>
+                <w:szCs w:val="18"/>
+              </w:rPr>
+              <w:t xml:space="preserve">22%</w:t>
             </w:r>
           </w:p>
         </w:tc>

</xml_diff>

<commit_message>
feat: TTN correct VAT calc — discountedPrice/1.22=цена без НДС, per-row amounts, correct totals, amount_words from total with VAT
Co-authored-by: Rekhmunov <Rekhmunov@users.noreply.github.com>
</commit_message>
<xml_diff>
--- a/web_static/torg12_tpl.docx
+++ b/web_static/torg12_tpl.docx
@@ -3390,7 +3390,7 @@
           </w:tcPr>
           <w:p>
             <w:pPr>
-              <w:jc w:val="center"/>
+              <w:jc w:val="right"/>
               <w:spacing w:before="0" w:after="0"/>
             </w:pPr>
             <w:r>
@@ -3401,7 +3401,7 @@
                 <w:b/>
                 <w:bCs/>
               </w:rPr>
-              <w:t xml:space="preserve">{{AMOUNT_WITH_VAT}}</w:t>
+              <w:t xml:space="preserve">{{ROW_AMOUNT_EXCL}}</w:t>
             </w:r>
           </w:p>
         </w:tc>
@@ -3444,7 +3444,7 @@
           </w:tcPr>
           <w:p>
             <w:pPr>
-              <w:jc w:val="center"/>
+              <w:jc w:val="right"/>
               <w:spacing w:before="0" w:after="0"/>
             </w:pPr>
             <w:r>
@@ -3455,7 +3455,7 @@
                 <w:b/>
                 <w:bCs/>
               </w:rPr>
-              <w:t xml:space="preserve">{{AMOUNT_WITH_VAT}}</w:t>
+              <w:t xml:space="preserve">{{ROW_VAT_SUM}}</w:t>
             </w:r>
           </w:p>
         </w:tc>
@@ -3472,19 +3472,18 @@
           </w:tcPr>
           <w:p>
             <w:pPr>
-              <w:pStyle w:val="Normal"/>
-              <w:snapToGrid w:val="false"/>
-              <w:jc w:val="center"/>
-              <w:rPr>
-                <w:sz w:val="18"/>
-                <w:szCs w:val="18"/>
-              </w:rPr>
-            </w:pPr>
-            <w:r>
-              <w:rPr>
-                <w:sz w:val="18"/>
-                <w:szCs w:val="18"/>
-              </w:rPr>
+              <w:jc w:val="right"/>
+              <w:spacing w:before="0" w:after="0"/>
+            </w:pPr>
+            <w:r>
+              <w:rPr>
+                <w:rFonts w:ascii="Times New Roman" w:hAnsi="Times New Roman" w:cs="Times New Roman"/>
+                <w:sz w:val="18"/>
+                <w:szCs w:val="18"/>
+                <w:b/>
+                <w:bCs/>
+              </w:rPr>
+              <w:t xml:space="preserve">{{ROW_AMOUNT_INCL}}</w:t>
             </w:r>
           </w:p>
         </w:tc>
@@ -3646,6 +3645,7 @@
           </w:tcPr>
           <w:p>
             <w:pPr>
+              <w:jc w:val="right"/>
               <w:spacing w:before="0" w:after="0"/>
             </w:pPr>
             <w:r>
@@ -3656,7 +3656,7 @@
                 <w:b/>
                 <w:bCs/>
               </w:rPr>
-              <w:t xml:space="preserve">{{AMOUNT}}</w:t>
+              <w:t xml:space="preserve">{{TOTAL_EXCL}}</w:t>
             </w:r>
           </w:p>
         </w:tc>
@@ -3673,7 +3673,7 @@
           </w:tcPr>
           <w:p>
             <w:pPr>
-              <w:jc w:val="center"/>
+              <w:jc w:val="right"/>
               <w:spacing w:before="0" w:after="0"/>
             </w:pPr>
             <w:r>
@@ -3684,7 +3684,7 @@
                 <w:b/>
                 <w:bCs/>
               </w:rPr>
-              <w:t xml:space="preserve">{{VAT_SUM}}</w:t>
+              <w:t xml:space="preserve">{{TOTAL_VAT}}</w:t>
             </w:r>
           </w:p>
         </w:tc>
@@ -3701,6 +3701,7 @@
           </w:tcPr>
           <w:p>
             <w:pPr>
+              <w:jc w:val="right"/>
               <w:spacing w:before="0" w:after="0"/>
             </w:pPr>
             <w:r>
@@ -3711,7 +3712,7 @@
                 <w:b/>
                 <w:bCs/>
               </w:rPr>
-              <w:t xml:space="preserve">{{AMOUNT}}</w:t>
+              <w:t xml:space="preserve">{{TOTAL_INCL}}</w:t>
             </w:r>
           </w:p>
         </w:tc>

</xml_diff>

<commit_message>
fix: TTN — replace long underscores with real values: листах=1, порядковых номеров=count of goods rows
Co-authored-by: Rekhmunov <Rekhmunov@users.noreply.github.com>
</commit_message>
<xml_diff>
--- a/web_static/torg12_tpl.docx
+++ b/web_static/torg12_tpl.docx
@@ -3752,7 +3752,7 @@
         <w:rPr>
           <w:szCs w:val="20"/>
         </w:rPr>
-        <w:t>Товарная накладная имеет  приложение на _________________________________________________________________________________________________________________ листах</w:t>
+        <w:t>Товарная накладная имеет приложение на {{PAGES_COUNT}} листах</w:t>
       </w:r>
     </w:p>
     <w:p>
@@ -3764,7 +3764,7 @@
         <w:rPr>
           <w:szCs w:val="20"/>
         </w:rPr>
-        <w:t>и содержит ________________________________________________________________________________________________________________________ порядковых номеров записей</w:t>
+        <w:t>и содержит {{ITEMS_COUNT}} порядковых номеров записей</w:t>
       </w:r>
     </w:p>
     <w:p>

</xml_diff>

<commit_message>
fix: TTN — fill По доверенности (supply ID + current date) and выданной (org name + requisites)
Co-authored-by: Rekhmunov <Rekhmunov@users.noreply.github.com>
</commit_message>
<xml_diff>
--- a/web_static/torg12_tpl.docx
+++ b/web_static/torg12_tpl.docx
@@ -4116,7 +4116,7 @@
               <w:rPr>
                 <w:szCs w:val="20"/>
               </w:rPr>
-              <w:t>По доверенности № ________________ от «____» ______________________ 200 __ г.</w:t>
+              <w:t>По доверенности № {{SUPPLY_ID}} от {{DOC_DATE_FULL}} г.</w:t>
             </w:r>
           </w:p>
           <w:p>
@@ -4131,7 +4131,7 @@
               <w:rPr>
                 <w:szCs w:val="20"/>
               </w:rPr>
-              <w:t>выданной ___________________________________________________________________</w:t>
+              <w:t>выданной {{ISSUED_BY}}</w:t>
             </w:r>
           </w:p>
           <w:p>

</xml_diff>

<commit_message>
fix: merge two-line листах/порядковых text into single paragraph in TTN template
Co-authored-by: Rekhmunov <Rekhmunov@users.noreply.github.com>
</commit_message>
<xml_diff>
--- a/web_static/torg12_tpl.docx
+++ b/web_static/torg12_tpl.docx
@@ -3752,19 +3752,7 @@
         <w:rPr>
           <w:szCs w:val="20"/>
         </w:rPr>
-        <w:t>Товарная накладная имеет приложение на {{PAGES_COUNT}} листах</w:t>
-      </w:r>
-    </w:p>
-    <w:p>
-      <w:pPr>
-        <w:pStyle w:val="Normal"/>
-        <w:rPr/>
-      </w:pPr>
-      <w:r>
-        <w:rPr>
-          <w:szCs w:val="20"/>
-        </w:rPr>
-        <w:t>и содержит {{ITEMS_COUNT}} порядковых номеров записей</w:t>
+        <w:t xml:space="preserve">Товарная накладная имеет приложение на {{PAGES_COUNT}} листах и содержит {{ITEMS_COUNT}} порядковых номеров записей</w:t>
       </w:r>
     </w:p>
     <w:p>

</xml_diff>

<commit_message>
fix: TTN — remove blank line after выданной; add 'водитель' before driver name with space for signature
Co-authored-by: Rekhmunov <Rekhmunov@users.noreply.github.com>
</commit_message>
<xml_diff>
--- a/web_static/torg12_tpl.docx
+++ b/web_static/torg12_tpl.docx
@@ -4137,50 +4137,43 @@
                 <w:sz w:val="16"/>
                 <w:szCs w:val="16"/>
               </w:rPr>
-              <w:t xml:space="preserve">                                                    </w:t>
+              <w:t>кем, кому (организация, должность, фамилия, и., о.)</w:t>
+            </w:r>
+          </w:p>
+          <w:p>
+            <w:pPr>
+              <w:pStyle w:val="Normal"/>
+              <w:spacing w:lineRule="auto" w:line="280"/>
+              <w:ind w:start="57" w:end="57"/>
+              <w:rPr>
+                <w:szCs w:val="20"/>
+              </w:rPr>
+            </w:pPr>
+            <w:r>
+              <w:rPr>
+                <w:szCs w:val="20"/>
+              </w:rPr>
+              <w:t>____________________________________________________________________________</w:t>
+            </w:r>
+          </w:p>
+          <w:p>
+            <w:pPr>
+              <w:pStyle w:val="Normal"/>
+              <w:ind w:start="57" w:end="57"/>
+              <w:rPr/>
+            </w:pPr>
+            <w:r>
+              <w:rPr>
+                <w:szCs w:val="20"/>
+              </w:rPr>
+              <w:t xml:space="preserve">Груз принял  водитель</w:t>
             </w:r>
             <w:r>
               <w:rPr>
                 <w:sz w:val="16"/>
                 <w:szCs w:val="16"/>
               </w:rPr>
-              <w:t>кем, кому (организация, должность, фамилия, и., о.)</w:t>
-            </w:r>
-          </w:p>
-          <w:p>
-            <w:pPr>
-              <w:pStyle w:val="Normal"/>
-              <w:spacing w:lineRule="auto" w:line="280"/>
-              <w:ind w:start="57" w:end="57"/>
-              <w:rPr>
-                <w:szCs w:val="20"/>
-              </w:rPr>
-            </w:pPr>
-            <w:r>
-              <w:rPr>
-                <w:szCs w:val="20"/>
-              </w:rPr>
-              <w:t>____________________________________________________________________________</w:t>
-            </w:r>
-          </w:p>
-          <w:p>
-            <w:pPr>
-              <w:pStyle w:val="Normal"/>
-              <w:ind w:start="57" w:end="57"/>
-              <w:rPr/>
-            </w:pPr>
-            <w:r>
-              <w:rPr>
-                <w:szCs w:val="20"/>
-              </w:rPr>
-              <w:t xml:space="preserve">Груз принял </w:t>
-            </w:r>
-            <w:r>
-              <w:rPr>
-                <w:sz w:val="16"/>
-                <w:szCs w:val="16"/>
-              </w:rPr>
-              <w:t xml:space="preserve"> </w:t>
+              <w:t xml:space="preserve">                    </w:t>
             </w:r>
             <w:r>
               <w:rPr>

</xml_diff>

<commit_message>
fix: TTN — remove long underscore before numeric amount on Всего отпущено line
Co-authored-by: Rekhmunov <Rekhmunov@users.noreply.github.com>
</commit_message>
<xml_diff>
--- a/web_static/torg12_tpl.docx
+++ b/web_static/torg12_tpl.docx
@@ -3950,13 +3950,6 @@
                 <w:szCs w:val="16"/>
               </w:rPr>
             </w:pPr>
-            <w:r>
-              <w:rPr>
-                <w:sz w:val="18"/>
-                <w:szCs w:val="18"/>
-              </w:rPr>
-              <w:t xml:space="preserve">_____________________________________________________________________ </w:t>
-            </w:r>
             <w:r>
               <w:rPr>
                 <w:szCs w:val="20"/>

</xml_diff>

<commit_message>
fix: TTN — remove duplicate numbers line before Всего отпущено, keep only combined line
Co-authored-by: Rekhmunov <Rekhmunov@users.noreply.github.com>
</commit_message>
<xml_diff>
--- a/web_static/torg12_tpl.docx
+++ b/web_static/torg12_tpl.docx
@@ -3887,23 +3887,6 @@
                 <w:szCs w:val="16"/>
               </w:rPr>
               <w:t>прописью</w:t>
-            </w:r>
-          </w:p>
-          <w:p>
-            <w:pPr>
-              <w:pStyle w:val="Normal"/>
-              <w:spacing w:lineRule="auto" w:line="280"/>
-              <w:ind w:start="57" w:end="57"/>
-              <w:rPr>
-                <w:sz w:val="16"/>
-                <w:szCs w:val="16"/>
-              </w:rPr>
-            </w:pPr>
-            <w:r>
-              <w:rPr>
-                <w:szCs w:val="20"/>
-              </w:rPr>
-              <w:t>{{TOTAL_RUB}} руб. {{TOTAL_KOP}} коп.</w:t>
             </w:r>
           </w:p>
           <w:p>

</xml_diff>

<commit_message>
fix: TTN — remove long underscore paragraph before Груз принял водитель
Co-authored-by: Rekhmunov <Rekhmunov@users.noreply.github.com>
</commit_message>
<xml_diff>
--- a/web_static/torg12_tpl.docx
+++ b/web_static/torg12_tpl.docx
@@ -4135,22 +4135,6 @@
                 <w:szCs w:val="16"/>
               </w:rPr>
               <w:t>кем, кому (организация, должность, фамилия, и., о.)</w:t>
-            </w:r>
-          </w:p>
-          <w:p>
-            <w:pPr>
-              <w:pStyle w:val="Normal"/>
-              <w:spacing w:lineRule="auto" w:line="280"/>
-              <w:ind w:start="57" w:end="57"/>
-              <w:rPr>
-                <w:szCs w:val="20"/>
-              </w:rPr>
-            </w:pPr>
-            <w:r>
-              <w:rPr>
-                <w:szCs w:val="20"/>
-              </w:rPr>
-              <w:t>____________________________________________________________________________</w:t>
             </w:r>
           </w:p>
           <w:p>

</xml_diff>